<commit_message>
"Upgrade Windows 10 IoT LTSC 21H2 → 22H2" added
</commit_message>
<xml_diff>
--- a/Troubleshooting and Tweak Guides for Windows/Troubleshooting and Tweak Guides for Windows.docx
+++ b/Troubleshooting and Tweak Guides for Windows/Troubleshooting and Tweak Guides for Windows.docx
@@ -7681,6 +7681,419 @@
           <w:szCs w:val="22"/>
         </w:rPr>
         <w:t xml:space="preserve">ctfmon.exe will now auto-launch at every startup.</w:t>
+      </w:r>
+    </w:p>
+    <w:p>
+      <w:pPr>
+        <w:spacing w:before="0" w:after="120"/>
+      </w:pPr>
+      <w:r>
+        <w:t xml:space="preserve"/>
+      </w:r>
+    </w:p>
+    <w:p>
+      <w:pPr>
+        <w:pBdr>
+          <w:top w:val="single" w:color="1F4E79" w:sz="6" w:space="2"/>
+          <w:bottom w:val="single" w:color="1F4E79" w:sz="6" w:space="2"/>
+          <w:left w:val="single" w:color="1F4E79" w:sz="18" w:space="4"/>
+        </w:pBdr>
+        <w:shd w:fill="2E75B6" w:val="clear"/>
+        <w:spacing w:before="240" w:after="0"/>
+        <w:ind w:left="180" w:right="180"/>
+      </w:pPr>
+      <w:r>
+        <w:rPr>
+          <w:rFonts w:ascii="Arial" w:cs="Arial" w:eastAsia="Arial" w:hAnsi="Arial"/>
+          <w:b/>
+          <w:bCs/>
+          <w:color w:val="FFFFFF"/>
+          <w:sz w:val="26"/>
+          <w:szCs w:val="26"/>
+        </w:rPr>
+        <w:t xml:space="preserve">Upgrade Windows 10 IoT LTSC 2021 from 21H2 to 22H2</w:t>
+      </w:r>
+    </w:p>
+    <w:p>
+      <w:pPr>
+        <w:spacing w:before="60" w:after="60"/>
+        <w:ind w:left="200"/>
+      </w:pPr>
+      <w:r>
+        <w:rPr>
+          <w:rFonts w:ascii="Arial" w:cs="Arial" w:eastAsia="Arial" w:hAnsi="Arial"/>
+          <w:i/>
+          <w:iCs/>
+          <w:color w:val="4A4A4A"/>
+          <w:sz w:val="20"/>
+          <w:szCs w:val="20"/>
+        </w:rPr>
+        <w:t xml:space="preserve">ℹ️  Windows 10 IoT LTSC 2021 does not receive feature updates via Windows Update. Use the official enablement package from Microsoft to manually upgrade from version 21H2 (OS build 19044) to 22H2 (OS build 19045).</w:t>
+      </w:r>
+    </w:p>
+    <w:p>
+      <w:pPr>
+        <w:spacing w:before="40" w:after="40"/>
+        <w:ind w:left="200"/>
+      </w:pPr>
+      <w:r>
+        <w:rPr>
+          <w:rFonts w:ascii="Arial" w:cs="Arial" w:eastAsia="Arial" w:hAnsi="Arial"/>
+          <w:b/>
+          <w:bCs/>
+          <w:color w:val="2E75B6"/>
+          <w:sz w:val="22"/>
+          <w:szCs w:val="22"/>
+        </w:rPr>
+        <w:t xml:space="preserve">1.  </w:t>
+      </w:r>
+      <w:r>
+        <w:rPr>
+          <w:rFonts w:ascii="Arial" w:cs="Arial" w:eastAsia="Arial" w:hAnsi="Arial"/>
+          <w:color w:val="1A1A1A"/>
+          <w:sz w:val="22"/>
+          <w:szCs w:val="22"/>
+        </w:rPr>
+        <w:t xml:space="preserve">Download the 22H2 enablement package from Microsoft’s official link:</w:t>
+      </w:r>
+    </w:p>
+    <w:p>
+      <w:pPr>
+        <w:spacing w:before="20" w:after="40"/>
+        <w:ind w:left="400"/>
+      </w:pPr>
+      <w:r>
+        <w:rPr>
+          <w:rFonts w:ascii="Courier New" w:cs="Courier New" w:eastAsia="Courier New" w:hAnsi="Courier New"/>
+          <w:color w:val="1A1A5A"/>
+          <w:sz w:val="18"/>
+          <w:szCs w:val="18"/>
+          <w:shd w:fill="EAEFF7" w:val="clear"/>
+        </w:rPr>
+        <w:t xml:space="preserve">https://catalog.s.download.windowsupdate.com/c/upgr/2022/07/windows10.0-kb5015684-x64_523c039b86ca98f2d818c4e6706e2cc94b634c4a.msu</w:t>
+      </w:r>
+    </w:p>
+    <w:p>
+      <w:pPr>
+        <w:spacing w:before="40" w:after="40"/>
+        <w:ind w:left="200"/>
+      </w:pPr>
+      <w:r>
+        <w:rPr>
+          <w:rFonts w:ascii="Arial" w:cs="Arial" w:eastAsia="Arial" w:hAnsi="Arial"/>
+          <w:b/>
+          <w:bCs/>
+          <w:color w:val="2E75B6"/>
+          <w:sz w:val="22"/>
+          <w:szCs w:val="22"/>
+        </w:rPr>
+        <w:t xml:space="preserve">2.  </w:t>
+      </w:r>
+      <w:r>
+        <w:rPr>
+          <w:rFonts w:ascii="Arial" w:cs="Arial" w:eastAsia="Arial" w:hAnsi="Arial"/>
+          <w:color w:val="1A1A1A"/>
+          <w:sz w:val="22"/>
+          <w:szCs w:val="22"/>
+        </w:rPr>
+        <w:t xml:space="preserve">Extract the </w:t>
+      </w:r>
+      <w:r>
+        <w:rPr>
+          <w:rFonts w:ascii="Courier New" w:cs="Courier New" w:eastAsia="Courier New" w:hAnsi="Courier New"/>
+          <w:color w:val="1A1A5A"/>
+          <w:sz w:val="20"/>
+          <w:szCs w:val="20"/>
+          <w:shd w:fill="EAEFF7" w:val="clear"/>
+        </w:rPr>
+        <w:t xml:space="preserve">.msu</w:t>
+      </w:r>
+      <w:r>
+        <w:rPr>
+          <w:rFonts w:ascii="Arial" w:cs="Arial" w:eastAsia="Arial" w:hAnsi="Arial"/>
+          <w:color w:val="1A1A1A"/>
+          <w:sz w:val="22"/>
+          <w:szCs w:val="22"/>
+        </w:rPr>
+        <w:t xml:space="preserve"> file to a folder using WinRAR or 7-Zip. Then extract the contents of the </w:t>
+      </w:r>
+      <w:r>
+        <w:rPr>
+          <w:rFonts w:ascii="Courier New" w:cs="Courier New" w:eastAsia="Courier New" w:hAnsi="Courier New"/>
+          <w:color w:val="1A1A5A"/>
+          <w:sz w:val="20"/>
+          <w:szCs w:val="20"/>
+          <w:shd w:fill="EAEFF7" w:val="clear"/>
+        </w:rPr>
+        <w:t xml:space="preserve">Windows10.0-KB5015684-x64_PSFX.cab</w:t>
+      </w:r>
+      <w:r>
+        <w:rPr>
+          <w:rFonts w:ascii="Arial" w:cs="Arial" w:eastAsia="Arial" w:hAnsi="Arial"/>
+          <w:color w:val="1A1A1A"/>
+          <w:sz w:val="22"/>
+          <w:szCs w:val="22"/>
+        </w:rPr>
+        <w:t xml:space="preserve"> file (that came out of the first extraction) to a separate folder, also using WinRAR or 7-Zip.</w:t>
+      </w:r>
+    </w:p>
+    <w:p>
+      <w:pPr>
+        <w:spacing w:before="40" w:after="40"/>
+        <w:ind w:left="200"/>
+      </w:pPr>
+      <w:r>
+        <w:rPr>
+          <w:rFonts w:ascii="Arial" w:cs="Arial" w:eastAsia="Arial" w:hAnsi="Arial"/>
+          <w:b/>
+          <w:bCs/>
+          <w:color w:val="2E75B6"/>
+          <w:sz w:val="22"/>
+          <w:szCs w:val="22"/>
+        </w:rPr>
+        <w:t xml:space="preserve">3.  </w:t>
+      </w:r>
+      <w:r>
+        <w:rPr>
+          <w:rFonts w:ascii="Arial" w:cs="Arial" w:eastAsia="Arial" w:hAnsi="Arial"/>
+          <w:color w:val="1A1A1A"/>
+          <w:sz w:val="22"/>
+          <w:szCs w:val="22"/>
+        </w:rPr>
+        <w:t xml:space="preserve">Move the folder containing the extracted CAB contents to an easily accessible location (e.g., the root of the C: drive). Example path:</w:t>
+      </w:r>
+      <w:r>
+        <w:rPr>
+          <w:rFonts w:ascii="Arial" w:cs="Arial" w:eastAsia="Arial" w:hAnsi="Arial"/>
+          <w:sz w:val="22"/>
+          <w:szCs w:val="22"/>
+        </w:rPr>
+        <w:t xml:space="preserve">  </w:t>
+      </w:r>
+      <w:r>
+        <w:rPr>
+          <w:rFonts w:ascii="Courier New" w:cs="Courier New" w:eastAsia="Courier New" w:hAnsi="Courier New"/>
+          <w:color w:val="1A1A5A"/>
+          <w:sz w:val="20"/>
+          <w:szCs w:val="20"/>
+          <w:shd w:fill="EAEFF7" w:val="clear"/>
+        </w:rPr>
+        <w:t xml:space="preserve">C:\Windows10.0-KB5015684-x64_PSFX</w:t>
+      </w:r>
+    </w:p>
+    <w:p>
+      <w:pPr>
+        <w:spacing w:before="40" w:after="40"/>
+        <w:ind w:left="200"/>
+      </w:pPr>
+      <w:r>
+        <w:rPr>
+          <w:rFonts w:ascii="Arial" w:cs="Arial" w:eastAsia="Arial" w:hAnsi="Arial"/>
+          <w:b/>
+          <w:bCs/>
+          <w:color w:val="2E75B6"/>
+          <w:sz w:val="22"/>
+          <w:szCs w:val="22"/>
+        </w:rPr>
+        <w:t xml:space="preserve">4.  </w:t>
+      </w:r>
+      <w:r>
+        <w:rPr>
+          <w:rFonts w:ascii="Arial" w:cs="Arial" w:eastAsia="Arial" w:hAnsi="Arial"/>
+          <w:color w:val="1A1A1A"/>
+          <w:sz w:val="22"/>
+          <w:szCs w:val="22"/>
+        </w:rPr>
+        <w:t xml:space="preserve">Run PowerShell as an administrator, then enter the following commands in order:</w:t>
+      </w:r>
+    </w:p>
+    <w:p>
+      <w:pPr>
+        <w:spacing w:before="20" w:after="4"/>
+        <w:ind w:left="400"/>
+      </w:pPr>
+      <w:r>
+        <w:rPr>
+          <w:rFonts w:ascii="Courier New" w:cs="Courier New" w:eastAsia="Courier New" w:hAnsi="Courier New"/>
+          <w:color w:val="1A1A5A"/>
+          <w:sz w:val="18"/>
+          <w:szCs w:val="18"/>
+          <w:shd w:fill="EAEFF7" w:val="clear"/>
+        </w:rPr>
+        <w:t xml:space="preserve">cd C:\Windows10.0-KB5015684-x64_PSFX</w:t>
+      </w:r>
+    </w:p>
+    <w:p>
+      <w:pPr>
+        <w:spacing w:before="4" w:after="20"/>
+        <w:ind w:left="400"/>
+      </w:pPr>
+      <w:r>
+        <w:rPr>
+          <w:rFonts w:ascii="Courier New" w:cs="Courier New" w:eastAsia="Courier New" w:hAnsi="Courier New"/>
+          <w:color w:val="1A1A5A"/>
+          <w:sz w:val="18"/>
+          <w:szCs w:val="18"/>
+          <w:shd w:fill="EAEFF7" w:val="clear"/>
+        </w:rPr>
+        <w:t xml:space="preserve">Dism /online /add-package /packagepath:microsoft-windows-22h2enablement-package~31bf3856ad364e35~amd64~~10.0.19041.1799.mum</w:t>
+      </w:r>
+    </w:p>
+    <w:p>
+      <w:pPr>
+        <w:spacing w:before="20" w:after="40"/>
+        <w:ind w:left="200"/>
+      </w:pPr>
+      <w:r>
+        <w:rPr>
+          <w:rFonts w:ascii="Arial" w:cs="Arial" w:eastAsia="Arial" w:hAnsi="Arial"/>
+          <w:i/>
+          <w:iCs/>
+          <w:color w:val="666666"/>
+          <w:sz w:val="19"/>
+          <w:szCs w:val="19"/>
+        </w:rPr>
+        <w:t xml:space="preserve">⤵️  Adjust the first command if your folder name differs. After the second command runs, you will be prompted to restart — press Y to accept.</w:t>
+      </w:r>
+    </w:p>
+    <w:p>
+      <w:pPr>
+        <w:spacing w:before="60" w:after="40"/>
+        <w:ind w:left="200"/>
+      </w:pPr>
+      <w:r>
+        <w:rPr>
+          <w:rFonts w:ascii="Arial" w:cs="Arial" w:eastAsia="Arial" w:hAnsi="Arial"/>
+          <w:color w:val="1A1A1A"/>
+          <w:sz w:val="22"/>
+          <w:szCs w:val="22"/>
+        </w:rPr>
+        <w:t xml:space="preserve">After restarting, open Run (Win+R) → type </w:t>
+      </w:r>
+      <w:r>
+        <w:rPr>
+          <w:rFonts w:ascii="Courier New" w:cs="Courier New" w:eastAsia="Courier New" w:hAnsi="Courier New"/>
+          <w:color w:val="1A1A5A"/>
+          <w:sz w:val="20"/>
+          <w:szCs w:val="20"/>
+          <w:shd w:fill="EAEFF7" w:val="clear"/>
+        </w:rPr>
+        <w:t xml:space="preserve">winver</w:t>
+      </w:r>
+      <w:r>
+        <w:rPr>
+          <w:rFonts w:ascii="Arial" w:cs="Arial" w:eastAsia="Arial" w:hAnsi="Arial"/>
+          <w:color w:val="1A1A1A"/>
+          <w:sz w:val="22"/>
+          <w:szCs w:val="22"/>
+        </w:rPr>
+        <w:t xml:space="preserve"> to confirm. The version should now show </w:t>
+      </w:r>
+      <w:r>
+        <w:rPr>
+          <w:rFonts w:ascii="Arial" w:cs="Arial" w:eastAsia="Arial" w:hAnsi="Arial"/>
+          <w:b/>
+          <w:bCs/>
+          <w:color w:val="1A1A1A"/>
+          <w:sz w:val="22"/>
+          <w:szCs w:val="22"/>
+        </w:rPr>
+        <w:t xml:space="preserve">22H2</w:t>
+      </w:r>
+      <w:r>
+        <w:rPr>
+          <w:rFonts w:ascii="Arial" w:cs="Arial" w:eastAsia="Arial" w:hAnsi="Arial"/>
+          <w:color w:val="1A1A1A"/>
+          <w:sz w:val="22"/>
+          <w:szCs w:val="22"/>
+        </w:rPr>
+        <w:t xml:space="preserve"> and OS build </w:t>
+      </w:r>
+      <w:r>
+        <w:rPr>
+          <w:rFonts w:ascii="Arial" w:cs="Arial" w:eastAsia="Arial" w:hAnsi="Arial"/>
+          <w:b/>
+          <w:bCs/>
+          <w:color w:val="1A1A1A"/>
+          <w:sz w:val="22"/>
+          <w:szCs w:val="22"/>
+        </w:rPr>
+        <w:t xml:space="preserve">19045</w:t>
+      </w:r>
+      <w:r>
+        <w:rPr>
+          <w:rFonts w:ascii="Arial" w:cs="Arial" w:eastAsia="Arial" w:hAnsi="Arial"/>
+          <w:color w:val="1A1A1A"/>
+          <w:sz w:val="22"/>
+          <w:szCs w:val="22"/>
+        </w:rPr>
+        <w:t xml:space="preserve">.</w:t>
+      </w:r>
+    </w:p>
+    <w:p>
+      <w:pPr>
+        <w:spacing w:before="120" w:after="40"/>
+        <w:ind w:left="200"/>
+      </w:pPr>
+      <w:r>
+        <w:rPr>
+          <w:rFonts w:ascii="Arial" w:cs="Arial" w:eastAsia="Arial" w:hAnsi="Arial"/>
+          <w:b/>
+          <w:bCs/>
+          <w:color w:val="C55A11"/>
+          <w:sz w:val="22"/>
+          <w:szCs w:val="22"/>
+        </w:rPr>
+        <w:t xml:space="preserve">To Uninstall / Roll Back to 21H2:</w:t>
+      </w:r>
+    </w:p>
+    <w:p>
+      <w:pPr>
+        <w:spacing w:before="20" w:after="4"/>
+        <w:ind w:left="400"/>
+      </w:pPr>
+      <w:r>
+        <w:rPr>
+          <w:rFonts w:ascii="Courier New" w:cs="Courier New" w:eastAsia="Courier New" w:hAnsi="Courier New"/>
+          <w:color w:val="1A1A5A"/>
+          <w:sz w:val="18"/>
+          <w:szCs w:val="18"/>
+          <w:shd w:fill="EAEFF7" w:val="clear"/>
+        </w:rPr>
+        <w:t xml:space="preserve">cd C:\Windows10.0-KB5015684-x64_PSFX</w:t>
+      </w:r>
+    </w:p>
+    <w:p>
+      <w:pPr>
+        <w:spacing w:before="4" w:after="20"/>
+        <w:ind w:left="400"/>
+      </w:pPr>
+      <w:r>
+        <w:rPr>
+          <w:rFonts w:ascii="Courier New" w:cs="Courier New" w:eastAsia="Courier New" w:hAnsi="Courier New"/>
+          <w:color w:val="1A1A5A"/>
+          <w:sz w:val="18"/>
+          <w:szCs w:val="18"/>
+          <w:shd w:fill="EAEFF7" w:val="clear"/>
+        </w:rPr>
+        <w:t xml:space="preserve">Dism /online /remove-package /packagename:microsoft-windows-22h2enablement-package~31bf3856ad364e35~amd64~~10.0.19041.1799</w:t>
+      </w:r>
+    </w:p>
+    <w:p>
+      <w:pPr>
+        <w:spacing w:before="20" w:after="40"/>
+        <w:ind w:left="200"/>
+      </w:pPr>
+      <w:r>
+        <w:rPr>
+          <w:rFonts w:ascii="Arial" w:cs="Arial" w:eastAsia="Arial" w:hAnsi="Arial"/>
+          <w:i/>
+          <w:iCs/>
+          <w:color w:val="666666"/>
+          <w:sz w:val="19"/>
+          <w:szCs w:val="19"/>
+        </w:rPr>
+        <w:t xml:space="preserve">⤵️  After uninstalling and restarting, the OS should revert to version 21H2 and OS build 19044.</w:t>
       </w:r>
     </w:p>
     <w:p>
@@ -10798,6 +11211,134 @@
           </w:p>
         </w:tc>
       </w:tr>
+      <w:tr>
+        <w:tc>
+          <w:tcPr>
+            <w:tcW w:type="dxa" w:w="3800"/>
+            <w:tcBorders>
+              <w:top w:val="single" w:color="CCCCCC" w:sz="1"/>
+              <w:left w:val="single" w:color="CCCCCC" w:sz="1"/>
+              <w:bottom w:val="single" w:color="CCCCCC" w:sz="1"/>
+              <w:right w:val="single" w:color="CCCCCC" w:sz="1"/>
+            </w:tcBorders>
+            <w:shd w:fill="F5FAFF" w:val="clear"/>
+            <w:tcMar>
+              <w:top w:type="dxa" w:w="80"/>
+              <w:left w:type="dxa" w:w="120"/>
+              <w:bottom w:type="dxa" w:w="80"/>
+              <w:right w:type="dxa" w:w="120"/>
+            </w:tcMar>
+          </w:tcPr>
+          <w:p>
+            <w:r>
+              <w:rPr>
+                <w:rFonts w:ascii="Arial" w:cs="Arial" w:eastAsia="Arial" w:hAnsi="Arial"/>
+                <w:b w:val="false"/>
+                <w:bCs w:val="false"/>
+                <w:color w:val="1A1A1A"/>
+                <w:sz w:val="18"/>
+                <w:szCs w:val="18"/>
+              </w:rPr>
+              <w:t xml:space="preserve">Upgrade IoT LTSC 21H2 → 22H2</w:t>
+            </w:r>
+          </w:p>
+        </w:tc>
+        <w:tc>
+          <w:tcPr>
+            <w:tcW w:type="dxa" w:w="5560"/>
+            <w:tcBorders>
+              <w:top w:val="single" w:color="CCCCCC" w:sz="1"/>
+              <w:left w:val="single" w:color="CCCCCC" w:sz="1"/>
+              <w:bottom w:val="single" w:color="CCCCCC" w:sz="1"/>
+              <w:right w:val="single" w:color="CCCCCC" w:sz="1"/>
+            </w:tcBorders>
+            <w:shd w:fill="F5FAFF" w:val="clear"/>
+            <w:tcMar>
+              <w:top w:type="dxa" w:w="80"/>
+              <w:left w:type="dxa" w:w="120"/>
+              <w:bottom w:type="dxa" w:w="80"/>
+              <w:right w:type="dxa" w:w="120"/>
+            </w:tcMar>
+          </w:tcPr>
+          <w:p>
+            <w:r>
+              <w:rPr>
+                <w:rFonts w:ascii="Courier New" w:cs="Courier New" w:eastAsia="Courier New" w:hAnsi="Courier New"/>
+                <w:b w:val="false"/>
+                <w:bCs w:val="false"/>
+                <w:color w:val="1A1A6A"/>
+                <w:sz w:val="18"/>
+                <w:szCs w:val="18"/>
+              </w:rPr>
+              <w:t xml:space="preserve">Dism /online /add-package /packagepath:microsoft-windows-22h2enablement-package~31bf3856ad364e35~amd64~~10.0.19041.1799.mum</w:t>
+            </w:r>
+          </w:p>
+        </w:tc>
+      </w:tr>
+      <w:tr>
+        <w:tc>
+          <w:tcPr>
+            <w:tcW w:type="dxa" w:w="3800"/>
+            <w:tcBorders>
+              <w:top w:val="single" w:color="CCCCCC" w:sz="1"/>
+              <w:left w:val="single" w:color="CCCCCC" w:sz="1"/>
+              <w:bottom w:val="single" w:color="CCCCCC" w:sz="1"/>
+              <w:right w:val="single" w:color="CCCCCC" w:sz="1"/>
+            </w:tcBorders>
+            <w:shd w:fill="FFFFFF" w:val="clear"/>
+            <w:tcMar>
+              <w:top w:type="dxa" w:w="80"/>
+              <w:left w:type="dxa" w:w="120"/>
+              <w:bottom w:type="dxa" w:w="80"/>
+              <w:right w:type="dxa" w:w="120"/>
+            </w:tcMar>
+          </w:tcPr>
+          <w:p>
+            <w:r>
+              <w:rPr>
+                <w:rFonts w:ascii="Arial" w:cs="Arial" w:eastAsia="Arial" w:hAnsi="Arial"/>
+                <w:b w:val="false"/>
+                <w:bCs w:val="false"/>
+                <w:color w:val="1A1A1A"/>
+                <w:sz w:val="18"/>
+                <w:szCs w:val="18"/>
+              </w:rPr>
+              <w:t xml:space="preserve">Roll back IoT LTSC 22H2 → 21H2</w:t>
+            </w:r>
+          </w:p>
+        </w:tc>
+        <w:tc>
+          <w:tcPr>
+            <w:tcW w:type="dxa" w:w="5560"/>
+            <w:tcBorders>
+              <w:top w:val="single" w:color="CCCCCC" w:sz="1"/>
+              <w:left w:val="single" w:color="CCCCCC" w:sz="1"/>
+              <w:bottom w:val="single" w:color="CCCCCC" w:sz="1"/>
+              <w:right w:val="single" w:color="CCCCCC" w:sz="1"/>
+            </w:tcBorders>
+            <w:shd w:fill="FFFFFF" w:val="clear"/>
+            <w:tcMar>
+              <w:top w:type="dxa" w:w="80"/>
+              <w:left w:type="dxa" w:w="120"/>
+              <w:bottom w:type="dxa" w:w="80"/>
+              <w:right w:type="dxa" w:w="120"/>
+            </w:tcMar>
+          </w:tcPr>
+          <w:p>
+            <w:r>
+              <w:rPr>
+                <w:rFonts w:ascii="Courier New" w:cs="Courier New" w:eastAsia="Courier New" w:hAnsi="Courier New"/>
+                <w:b w:val="false"/>
+                <w:bCs w:val="false"/>
+                <w:color w:val="1A1A6A"/>
+                <w:sz w:val="18"/>
+                <w:szCs w:val="18"/>
+              </w:rPr>
+              <w:t xml:space="preserve">Dism /online /remove-package /packagename:microsoft-windows-22h2enablement-package~31bf3856ad364e35~amd64~~10.0.19041.1799</w:t>
+            </w:r>
+          </w:p>
+        </w:tc>
+      </w:tr>
     </w:tbl>
     <w:p>
       <w:pPr>

</xml_diff>